<commit_message>
Redesign with theme and responsivness
</commit_message>
<xml_diff>
--- a/Fawrii docs/5. FAQs BRIEF AND COPY.docx
+++ b/Fawrii docs/5. FAQs BRIEF AND COPY.docx
@@ -1,6 +1,6 @@
 
 <file path=word/document.xml><?xml version="1.0" encoding="utf-8"?>
-<w:document xmlns:wpc="http://schemas.microsoft.com/office/word/2010/wordprocessingCanvas" xmlns:cx="http://schemas.microsoft.com/office/drawing/2014/chartex" xmlns:cx1="http://schemas.microsoft.com/office/drawing/2015/9/8/chartex" xmlns:cx2="http://schemas.microsoft.com/office/drawing/2015/10/21/chartex" xmlns:cx3="http://schemas.microsoft.com/office/drawing/2016/5/9/chartex" xmlns:cx4="http://schemas.microsoft.com/office/drawing/2016/5/10/chartex" xmlns:cx5="http://schemas.microsoft.com/office/drawing/2016/5/11/chartex" xmlns:cx6="http://schemas.microsoft.com/office/drawing/2016/5/12/chartex" xmlns:cx7="http://schemas.microsoft.com/office/drawing/2016/5/13/chartex" xmlns:cx8="http://schemas.microsoft.com/office/drawing/2016/5/14/chartex" xmlns:mc="http://schemas.openxmlformats.org/markup-compatibility/2006" xmlns:aink="http://schemas.microsoft.com/office/drawing/2016/ink" xmlns:am3d="http://schemas.microsoft.com/office/drawing/2017/model3d" xmlns:o="urn:schemas-microsoft-com:office:office" xmlns:r="http://schemas.openxmlformats.org/officeDocument/2006/relationships" xmlns:m="http://schemas.openxmlformats.org/officeDocument/2006/math" xmlns:v="urn:schemas-microsoft-com:vml" xmlns:wp14="http://schemas.microsoft.com/office/word/2010/wordprocessingDrawing" xmlns:wp="http://schemas.openxmlformats.org/drawingml/2006/wordprocessingDrawing" xmlns:w10="urn:schemas-microsoft-com:office:word" xmlns:w="http://schemas.openxmlformats.org/wordprocessingml/2006/main" xmlns:w14="http://schemas.microsoft.com/office/word/2010/wordml" xmlns:w15="http://schemas.microsoft.com/office/word/2012/wordml" xmlns:w16cex="http://schemas.microsoft.com/office/word/2018/wordml/cex" xmlns:w16cid="http://schemas.microsoft.com/office/word/2016/wordml/cid" xmlns:w16="http://schemas.microsoft.com/office/word/2018/wordml" xmlns:w16sdtdh="http://schemas.microsoft.com/office/word/2020/wordml/sdtdatahash" xmlns:w16se="http://schemas.microsoft.com/office/word/2015/wordml/symex" xmlns:wpg="http://schemas.microsoft.com/office/word/2010/wordprocessingGroup" xmlns:wpi="http://schemas.microsoft.com/office/word/2010/wordprocessingInk" xmlns:wne="http://schemas.microsoft.com/office/word/2006/wordml" xmlns:wps="http://schemas.microsoft.com/office/word/2010/wordprocessingShape" mc:Ignorable="w14 w15 w16se w16cid w16 w16cex w16sdtdh wp14">
+<w:document xmlns:wpc="http://schemas.microsoft.com/office/word/2010/wordprocessingCanvas" xmlns:cx="http://schemas.microsoft.com/office/drawing/2014/chartex" xmlns:cx1="http://schemas.microsoft.com/office/drawing/2015/9/8/chartex" xmlns:cx2="http://schemas.microsoft.com/office/drawing/2015/10/21/chartex" xmlns:cx3="http://schemas.microsoft.com/office/drawing/2016/5/9/chartex" xmlns:cx4="http://schemas.microsoft.com/office/drawing/2016/5/10/chartex" xmlns:cx5="http://schemas.microsoft.com/office/drawing/2016/5/11/chartex" xmlns:cx6="http://schemas.microsoft.com/office/drawing/2016/5/12/chartex" xmlns:cx7="http://schemas.microsoft.com/office/drawing/2016/5/13/chartex" xmlns:cx8="http://schemas.microsoft.com/office/drawing/2016/5/14/chartex" xmlns:mc="http://schemas.openxmlformats.org/markup-compatibility/2006" xmlns:aink="http://schemas.microsoft.com/office/drawing/2016/ink" xmlns:am3d="http://schemas.microsoft.com/office/drawing/2017/model3d" xmlns:o="urn:schemas-microsoft-com:office:office" xmlns:oel="http://schemas.microsoft.com/office/2019/extlst" xmlns:r="http://schemas.openxmlformats.org/officeDocument/2006/relationships" xmlns:m="http://schemas.openxmlformats.org/officeDocument/2006/math" xmlns:v="urn:schemas-microsoft-com:vml" xmlns:wp14="http://schemas.microsoft.com/office/word/2010/wordprocessingDrawing" xmlns:wp="http://schemas.openxmlformats.org/drawingml/2006/wordprocessingDrawing" xmlns:w10="urn:schemas-microsoft-com:office:word" xmlns:w="http://schemas.openxmlformats.org/wordprocessingml/2006/main" xmlns:w14="http://schemas.microsoft.com/office/word/2010/wordml" xmlns:w15="http://schemas.microsoft.com/office/word/2012/wordml" xmlns:w16cex="http://schemas.microsoft.com/office/word/2018/wordml/cex" xmlns:w16cid="http://schemas.microsoft.com/office/word/2016/wordml/cid" xmlns:w16="http://schemas.microsoft.com/office/word/2018/wordml" xmlns:w16du="http://schemas.microsoft.com/office/word/2023/wordml/word16du" xmlns:w16sdtdh="http://schemas.microsoft.com/office/word/2020/wordml/sdtdatahash" xmlns:w16sdtfl="http://schemas.microsoft.com/office/word/2024/wordml/sdtformatlock" xmlns:w16se="http://schemas.microsoft.com/office/word/2015/wordml/symex" xmlns:wpg="http://schemas.microsoft.com/office/word/2010/wordprocessingGroup" xmlns:wpi="http://schemas.microsoft.com/office/word/2010/wordprocessingInk" xmlns:wne="http://schemas.microsoft.com/office/word/2006/wordml" xmlns:wps="http://schemas.microsoft.com/office/word/2010/wordprocessingShape" mc:Ignorable="w14 w15 w16se w16cid w16 w16cex w16sdtdh w16sdtfl w16du wp14">
   <w:body>
     <w:p>
       <w:pPr>
@@ -71,13 +71,7 @@
         </w:numPr>
       </w:pPr>
       <w:r>
-        <w:t xml:space="preserve">Hero </w:t>
-      </w:r>
-      <w:r>
-        <w:t>-</w:t>
-      </w:r>
-      <w:r>
-        <w:t xml:space="preserve"> reassurance and clarity</w:t>
+        <w:t>Hero - reassurance and clarity</w:t>
       </w:r>
     </w:p>
     <w:p>
@@ -1044,14 +1038,7 @@
           <w:rStyle w:val="Strong"/>
           <w:color w:val="FF0000"/>
         </w:rPr>
-        <w:t xml:space="preserve">1) </w:t>
-      </w:r>
-      <w:r>
-        <w:rPr>
-          <w:rStyle w:val="Strong"/>
-          <w:color w:val="FF0000"/>
-        </w:rPr>
-        <w:t>Is there a minimum age to tutor on Fawrii?</w:t>
+        <w:t>1) Is there a minimum age to tutor on Fawrii?</w:t>
       </w:r>
     </w:p>
     <w:p>
@@ -1114,21 +1101,7 @@
         <w:rPr>
           <w:color w:val="FF0000"/>
         </w:rPr>
-        <w:t xml:space="preserve">This ensures tutors can complete verification, </w:t>
-      </w:r>
-      <w:proofErr w:type="gramStart"/>
-      <w:r>
-        <w:rPr>
-          <w:color w:val="FF0000"/>
-        </w:rPr>
-        <w:t>enter into</w:t>
-      </w:r>
-      <w:proofErr w:type="gramEnd"/>
-      <w:r>
-        <w:rPr>
-          <w:color w:val="FF0000"/>
-        </w:rPr>
-        <w:t xml:space="preserve"> a contract, and receive payments independently.</w:t>
+        <w:t>This ensures tutors can complete verification, enter into a contract, and receive payments independently.</w:t>
       </w:r>
     </w:p>
     <w:p>
@@ -1209,51 +1182,30 @@
           <w:color w:val="FF0000"/>
         </w:rPr>
         <w:br/>
-        <w:t xml:space="preserve">Your experience and background are reviewed during </w:t>
-      </w:r>
-      <w:proofErr w:type="gramStart"/>
-      <w:r>
-        <w:rPr>
-          <w:color w:val="FF0000"/>
-        </w:rPr>
-        <w:t>onboarding</w:t>
-      </w:r>
-      <w:proofErr w:type="gramEnd"/>
-      <w:r>
-        <w:rPr>
-          <w:color w:val="FF0000"/>
-        </w:rPr>
-        <w:t xml:space="preserve"> so expectations are clear from the start.</w:t>
-      </w:r>
-    </w:p>
-    <w:p>
-      <w:pPr>
-        <w:pStyle w:val="NoSpacing"/>
-        <w:rPr>
-          <w:color w:val="FF0000"/>
-        </w:rPr>
-      </w:pPr>
-    </w:p>
-    <w:p>
-      <w:pPr>
-        <w:pStyle w:val="NoSpacing"/>
-        <w:rPr>
-          <w:color w:val="FF0000"/>
-        </w:rPr>
-      </w:pPr>
-      <w:r>
-        <w:rPr>
-          <w:rStyle w:val="Strong"/>
-          <w:color w:val="FF0000"/>
-        </w:rPr>
-        <w:t xml:space="preserve">3) </w:t>
-      </w:r>
-      <w:r>
-        <w:rPr>
-          <w:rStyle w:val="Strong"/>
-          <w:color w:val="FF0000"/>
-        </w:rPr>
-        <w:t>Do I need a DBS check?</w:t>
+        <w:t>Your experience and background are reviewed during onboarding so expectations are clear from the start.</w:t>
+      </w:r>
+    </w:p>
+    <w:p>
+      <w:pPr>
+        <w:pStyle w:val="NoSpacing"/>
+        <w:rPr>
+          <w:color w:val="FF0000"/>
+        </w:rPr>
+      </w:pPr>
+    </w:p>
+    <w:p>
+      <w:pPr>
+        <w:pStyle w:val="NoSpacing"/>
+        <w:rPr>
+          <w:color w:val="FF0000"/>
+        </w:rPr>
+      </w:pPr>
+      <w:r>
+        <w:rPr>
+          <w:rStyle w:val="Strong"/>
+          <w:color w:val="FF0000"/>
+        </w:rPr>
+        <w:t>3) Do I need a DBS check?</w:t>
       </w:r>
     </w:p>
     <w:p>
@@ -1327,14 +1279,7 @@
           <w:rStyle w:val="Strong"/>
           <w:color w:val="FF0000"/>
         </w:rPr>
-        <w:t xml:space="preserve">4) </w:t>
-      </w:r>
-      <w:r>
-        <w:rPr>
-          <w:rStyle w:val="Strong"/>
-          <w:color w:val="FF0000"/>
-        </w:rPr>
-        <w:t>Is applying a commitment to take work?</w:t>
+        <w:t>4) Is applying a commitment to take work?</w:t>
       </w:r>
     </w:p>
     <w:p>
@@ -1408,14 +1353,7 @@
           <w:rStyle w:val="Strong"/>
           <w:color w:val="FF0000"/>
         </w:rPr>
-        <w:t xml:space="preserve">5) </w:t>
-      </w:r>
-      <w:r>
-        <w:rPr>
-          <w:rStyle w:val="Strong"/>
-          <w:color w:val="FF0000"/>
-        </w:rPr>
-        <w:t>Are there minimum availability requirements?</w:t>
+        <w:t>5) Are there minimum availability requirements?</w:t>
       </w:r>
     </w:p>
     <w:p>
@@ -1483,14 +1421,7 @@
           <w:color w:val="FF0000"/>
         </w:rPr>
         <w:lastRenderedPageBreak/>
-        <w:t xml:space="preserve">6) </w:t>
-      </w:r>
-      <w:r>
-        <w:rPr>
-          <w:rStyle w:val="Strong"/>
-          <w:color w:val="FF0000"/>
-        </w:rPr>
-        <w:t>Can I tutor on Fawrii alongside other work or platforms?</w:t>
+        <w:t>6) Can I tutor on Fawrii alongside other work or platforms?</w:t>
       </w:r>
     </w:p>
     <w:p>
@@ -1565,14 +1496,7 @@
           <w:rStyle w:val="Strong"/>
           <w:color w:val="FF0000"/>
         </w:rPr>
-        <w:t xml:space="preserve">7) </w:t>
-      </w:r>
-      <w:r>
-        <w:rPr>
-          <w:rStyle w:val="Strong"/>
-          <w:color w:val="FF0000"/>
-        </w:rPr>
-        <w:t>What subjects or levels can I tutor?</w:t>
+        <w:t>7) What subjects or levels can I tutor?</w:t>
       </w:r>
     </w:p>
     <w:p>
@@ -1646,14 +1570,7 @@
           <w:rStyle w:val="Strong"/>
           <w:color w:val="FF0000"/>
         </w:rPr>
-        <w:t xml:space="preserve">8) </w:t>
-      </w:r>
-      <w:r>
-        <w:rPr>
-          <w:rStyle w:val="Strong"/>
-          <w:color w:val="FF0000"/>
-        </w:rPr>
-        <w:t>How long does onboarding take?</w:t>
+        <w:t>8) How long does onboarding take?</w:t>
       </w:r>
     </w:p>
     <w:p>
@@ -1728,14 +1645,7 @@
           <w:rStyle w:val="Strong"/>
           <w:color w:val="FF0000"/>
         </w:rPr>
-        <w:t xml:space="preserve">9) </w:t>
-      </w:r>
-      <w:r>
-        <w:rPr>
-          <w:rStyle w:val="Strong"/>
-          <w:color w:val="FF0000"/>
-        </w:rPr>
-        <w:t>What if I’m new to online tutoring?</w:t>
+        <w:t>9) What if I’m new to online tutoring?</w:t>
       </w:r>
     </w:p>
     <w:p>
@@ -3692,14 +3602,7 @@
           <w:rStyle w:val="Strong"/>
           <w:color w:val="FF0000"/>
         </w:rPr>
-        <w:t xml:space="preserve">1) </w:t>
-      </w:r>
-      <w:r>
-        <w:rPr>
-          <w:rStyle w:val="Strong"/>
-          <w:color w:val="FF0000"/>
-        </w:rPr>
-        <w:t>Why are some sessions recorded?</w:t>
+        <w:t>1) Why are some sessions recorded?</w:t>
       </w:r>
       <w:r>
         <w:rPr>
@@ -3761,14 +3664,7 @@
           <w:rStyle w:val="Strong"/>
           <w:color w:val="FF0000"/>
         </w:rPr>
-        <w:t xml:space="preserve">2) </w:t>
-      </w:r>
-      <w:r>
-        <w:rPr>
-          <w:rStyle w:val="Strong"/>
-          <w:color w:val="FF0000"/>
-        </w:rPr>
-        <w:t>Are recordings used to judge tutors or assess teaching quality?</w:t>
+        <w:t>2) Are recordings used to judge tutors or assess teaching quality?</w:t>
       </w:r>
       <w:r>
         <w:rPr>
@@ -3838,14 +3734,7 @@
           <w:rStyle w:val="Strong"/>
           <w:color w:val="FF0000"/>
         </w:rPr>
-        <w:t xml:space="preserve">3) </w:t>
-      </w:r>
-      <w:r>
-        <w:rPr>
-          <w:rStyle w:val="Strong"/>
-          <w:color w:val="FF0000"/>
-        </w:rPr>
-        <w:t>Who can access recorded sessions?</w:t>
+        <w:t>3) Who can access recorded sessions?</w:t>
       </w:r>
       <w:r>
         <w:rPr>
@@ -3906,14 +3795,7 @@
           <w:rStyle w:val="Strong"/>
           <w:color w:val="FF0000"/>
         </w:rPr>
-        <w:t xml:space="preserve">4) </w:t>
-      </w:r>
-      <w:r>
-        <w:rPr>
-          <w:rStyle w:val="Strong"/>
-          <w:color w:val="FF0000"/>
-        </w:rPr>
-        <w:t>What happens if a concern is raised?</w:t>
+        <w:t>4) What happens if a concern is raised?</w:t>
       </w:r>
       <w:r>
         <w:rPr>
@@ -3974,14 +3856,7 @@
           <w:rStyle w:val="Strong"/>
           <w:color w:val="FF0000"/>
         </w:rPr>
-        <w:t xml:space="preserve">5) </w:t>
-      </w:r>
-      <w:r>
-        <w:rPr>
-          <w:rStyle w:val="Strong"/>
-          <w:color w:val="FF0000"/>
-        </w:rPr>
-        <w:t>What kind of concerns can be reported?</w:t>
+        <w:t>5) What kind of concerns can be reported?</w:t>
       </w:r>
       <w:r>
         <w:rPr>
@@ -4042,14 +3917,7 @@
           <w:rStyle w:val="Strong"/>
           <w:color w:val="FF0000"/>
         </w:rPr>
-        <w:t xml:space="preserve">6) </w:t>
-      </w:r>
-      <w:r>
-        <w:rPr>
-          <w:rStyle w:val="Strong"/>
-          <w:color w:val="FF0000"/>
-        </w:rPr>
-        <w:t>Will I be supported if a concern involves a student or parent?</w:t>
+        <w:t>6) Will I be supported if a concern involves a student or parent?</w:t>
       </w:r>
       <w:r>
         <w:rPr>
@@ -4110,14 +3978,7 @@
           <w:rStyle w:val="Strong"/>
           <w:color w:val="FF0000"/>
         </w:rPr>
-        <w:t xml:space="preserve">7) </w:t>
-      </w:r>
-      <w:r>
-        <w:rPr>
-          <w:rStyle w:val="Strong"/>
-          <w:color w:val="FF0000"/>
-        </w:rPr>
-        <w:t>Is safeguarding handled consistently across the platform?</w:t>
+        <w:t>7) Is safeguarding handled consistently across the platform?</w:t>
       </w:r>
       <w:r>
         <w:rPr>
@@ -4552,17 +4413,8 @@
           <w:rStyle w:val="Strong"/>
           <w:color w:val="FF0000"/>
         </w:rPr>
-        <w:t xml:space="preserve">Application </w:t>
-      </w:r>
-      <w:proofErr w:type="gramStart"/>
-      <w:r>
-        <w:rPr>
-          <w:rStyle w:val="Strong"/>
-          <w:color w:val="FF0000"/>
-        </w:rPr>
-        <w:t>review</w:t>
-      </w:r>
-      <w:proofErr w:type="gramEnd"/>
+        <w:t>Application review</w:t>
+      </w:r>
       <w:r>
         <w:rPr>
           <w:color w:val="FF0000"/>
@@ -5611,15 +5463,7 @@
         </w:numPr>
       </w:pPr>
       <w:r>
-        <w:t>Use a single, calm visual cue (</w:t>
-      </w:r>
-      <w:proofErr w:type="gramStart"/>
-      <w:r>
-        <w:t>e.g.</w:t>
-      </w:r>
-      <w:proofErr w:type="gramEnd"/>
-      <w:r>
-        <w:t xml:space="preserve"> shield, tick, or neutral classroom icon)</w:t>
+        <w:t>Use a single, calm visual cue (e.g. shield, tick, or neutral classroom icon)</w:t>
       </w:r>
     </w:p>
     <w:p>
@@ -6168,15 +6012,7 @@
         </w:numPr>
       </w:pPr>
       <w:r>
-        <w:t xml:space="preserve">No additional reassurance </w:t>
-      </w:r>
-      <w:proofErr w:type="gramStart"/>
-      <w:r>
-        <w:t>copy</w:t>
-      </w:r>
-      <w:proofErr w:type="gramEnd"/>
-      <w:r>
-        <w:t xml:space="preserve"> or feature reminders</w:t>
+        <w:t>No additional reassurance copy or feature reminders</w:t>
       </w:r>
     </w:p>
     <w:p>
@@ -6211,7 +6047,7 @@
 </file>
 
 <file path=word/numbering.xml><?xml version="1.0" encoding="utf-8"?>
-<w:numbering xmlns:wpc="http://schemas.microsoft.com/office/word/2010/wordprocessingCanvas" xmlns:cx="http://schemas.microsoft.com/office/drawing/2014/chartex" xmlns:cx1="http://schemas.microsoft.com/office/drawing/2015/9/8/chartex" xmlns:cx2="http://schemas.microsoft.com/office/drawing/2015/10/21/chartex" xmlns:cx3="http://schemas.microsoft.com/office/drawing/2016/5/9/chartex" xmlns:cx4="http://schemas.microsoft.com/office/drawing/2016/5/10/chartex" xmlns:cx5="http://schemas.microsoft.com/office/drawing/2016/5/11/chartex" xmlns:cx6="http://schemas.microsoft.com/office/drawing/2016/5/12/chartex" xmlns:cx7="http://schemas.microsoft.com/office/drawing/2016/5/13/chartex" xmlns:cx8="http://schemas.microsoft.com/office/drawing/2016/5/14/chartex" xmlns:mc="http://schemas.openxmlformats.org/markup-compatibility/2006" xmlns:aink="http://schemas.microsoft.com/office/drawing/2016/ink" xmlns:am3d="http://schemas.microsoft.com/office/drawing/2017/model3d" xmlns:o="urn:schemas-microsoft-com:office:office" xmlns:r="http://schemas.openxmlformats.org/officeDocument/2006/relationships" xmlns:m="http://schemas.openxmlformats.org/officeDocument/2006/math" xmlns:v="urn:schemas-microsoft-com:vml" xmlns:wp14="http://schemas.microsoft.com/office/word/2010/wordprocessingDrawing" xmlns:wp="http://schemas.openxmlformats.org/drawingml/2006/wordprocessingDrawing" xmlns:w10="urn:schemas-microsoft-com:office:word" xmlns:w="http://schemas.openxmlformats.org/wordprocessingml/2006/main" xmlns:w14="http://schemas.microsoft.com/office/word/2010/wordml" xmlns:w15="http://schemas.microsoft.com/office/word/2012/wordml" xmlns:w16cex="http://schemas.microsoft.com/office/word/2018/wordml/cex" xmlns:w16cid="http://schemas.microsoft.com/office/word/2016/wordml/cid" xmlns:w16="http://schemas.microsoft.com/office/word/2018/wordml" xmlns:w16sdtdh="http://schemas.microsoft.com/office/word/2020/wordml/sdtdatahash" xmlns:w16se="http://schemas.microsoft.com/office/word/2015/wordml/symex" xmlns:wpg="http://schemas.microsoft.com/office/word/2010/wordprocessingGroup" xmlns:wpi="http://schemas.microsoft.com/office/word/2010/wordprocessingInk" xmlns:wne="http://schemas.microsoft.com/office/word/2006/wordml" xmlns:wps="http://schemas.microsoft.com/office/word/2010/wordprocessingShape" mc:Ignorable="w14 w15 w16se w16cid w16 w16cex w16sdtdh wp14">
+<w:numbering xmlns:wpc="http://schemas.microsoft.com/office/word/2010/wordprocessingCanvas" xmlns:cx="http://schemas.microsoft.com/office/drawing/2014/chartex" xmlns:cx1="http://schemas.microsoft.com/office/drawing/2015/9/8/chartex" xmlns:cx2="http://schemas.microsoft.com/office/drawing/2015/10/21/chartex" xmlns:cx3="http://schemas.microsoft.com/office/drawing/2016/5/9/chartex" xmlns:cx4="http://schemas.microsoft.com/office/drawing/2016/5/10/chartex" xmlns:cx5="http://schemas.microsoft.com/office/drawing/2016/5/11/chartex" xmlns:cx6="http://schemas.microsoft.com/office/drawing/2016/5/12/chartex" xmlns:cx7="http://schemas.microsoft.com/office/drawing/2016/5/13/chartex" xmlns:cx8="http://schemas.microsoft.com/office/drawing/2016/5/14/chartex" xmlns:mc="http://schemas.openxmlformats.org/markup-compatibility/2006" xmlns:aink="http://schemas.microsoft.com/office/drawing/2016/ink" xmlns:am3d="http://schemas.microsoft.com/office/drawing/2017/model3d" xmlns:o="urn:schemas-microsoft-com:office:office" xmlns:oel="http://schemas.microsoft.com/office/2019/extlst" xmlns:r="http://schemas.openxmlformats.org/officeDocument/2006/relationships" xmlns:m="http://schemas.openxmlformats.org/officeDocument/2006/math" xmlns:v="urn:schemas-microsoft-com:vml" xmlns:wp14="http://schemas.microsoft.com/office/word/2010/wordprocessingDrawing" xmlns:wp="http://schemas.openxmlformats.org/drawingml/2006/wordprocessingDrawing" xmlns:w10="urn:schemas-microsoft-com:office:word" xmlns:w="http://schemas.openxmlformats.org/wordprocessingml/2006/main" xmlns:w14="http://schemas.microsoft.com/office/word/2010/wordml" xmlns:w15="http://schemas.microsoft.com/office/word/2012/wordml" xmlns:w16cex="http://schemas.microsoft.com/office/word/2018/wordml/cex" xmlns:w16cid="http://schemas.microsoft.com/office/word/2016/wordml/cid" xmlns:w16="http://schemas.microsoft.com/office/word/2018/wordml" xmlns:w16du="http://schemas.microsoft.com/office/word/2023/wordml/word16du" xmlns:w16sdtdh="http://schemas.microsoft.com/office/word/2020/wordml/sdtdatahash" xmlns:w16sdtfl="http://schemas.microsoft.com/office/word/2024/wordml/sdtformatlock" xmlns:w16se="http://schemas.microsoft.com/office/word/2015/wordml/symex" xmlns:wpg="http://schemas.microsoft.com/office/word/2010/wordprocessingGroup" xmlns:wpi="http://schemas.microsoft.com/office/word/2010/wordprocessingInk" xmlns:wne="http://schemas.microsoft.com/office/word/2006/wordml" xmlns:wps="http://schemas.microsoft.com/office/word/2010/wordprocessingShape" mc:Ignorable="w14 w15 w16se w16cid w16 w16cex w16sdtdh w16sdtfl w16du wp14">
   <w:abstractNum w:abstractNumId="0" w15:restartNumberingAfterBreak="0">
     <w:nsid w:val="013212B7"/>
     <w:multiLevelType w:val="hybridMultilevel"/>
@@ -8671,70 +8507,70 @@
       </w:rPr>
     </w:lvl>
   </w:abstractNum>
-  <w:num w:numId="1">
+  <w:num w:numId="1" w16cid:durableId="1061439007">
     <w:abstractNumId w:val="3"/>
   </w:num>
-  <w:num w:numId="2">
+  <w:num w:numId="2" w16cid:durableId="1063069053">
     <w:abstractNumId w:val="0"/>
   </w:num>
-  <w:num w:numId="3">
+  <w:num w:numId="3" w16cid:durableId="183053433">
     <w:abstractNumId w:val="15"/>
   </w:num>
-  <w:num w:numId="4">
+  <w:num w:numId="4" w16cid:durableId="1111052999">
     <w:abstractNumId w:val="14"/>
   </w:num>
-  <w:num w:numId="5">
+  <w:num w:numId="5" w16cid:durableId="1747066380">
     <w:abstractNumId w:val="2"/>
   </w:num>
-  <w:num w:numId="6">
+  <w:num w:numId="6" w16cid:durableId="1250040077">
     <w:abstractNumId w:val="5"/>
   </w:num>
-  <w:num w:numId="7">
+  <w:num w:numId="7" w16cid:durableId="2106680613">
     <w:abstractNumId w:val="13"/>
   </w:num>
-  <w:num w:numId="8">
+  <w:num w:numId="8" w16cid:durableId="1772049090">
     <w:abstractNumId w:val="10"/>
   </w:num>
-  <w:num w:numId="9">
+  <w:num w:numId="9" w16cid:durableId="1165323070">
     <w:abstractNumId w:val="6"/>
   </w:num>
-  <w:num w:numId="10">
+  <w:num w:numId="10" w16cid:durableId="1157839497">
     <w:abstractNumId w:val="8"/>
   </w:num>
-  <w:num w:numId="11">
+  <w:num w:numId="11" w16cid:durableId="191382447">
     <w:abstractNumId w:val="12"/>
   </w:num>
-  <w:num w:numId="12">
+  <w:num w:numId="12" w16cid:durableId="381908883">
     <w:abstractNumId w:val="20"/>
   </w:num>
-  <w:num w:numId="13">
+  <w:num w:numId="13" w16cid:durableId="2021202247">
     <w:abstractNumId w:val="4"/>
   </w:num>
-  <w:num w:numId="14">
+  <w:num w:numId="14" w16cid:durableId="2131433151">
     <w:abstractNumId w:val="21"/>
   </w:num>
-  <w:num w:numId="15">
+  <w:num w:numId="15" w16cid:durableId="166360112">
     <w:abstractNumId w:val="1"/>
   </w:num>
-  <w:num w:numId="16">
+  <w:num w:numId="16" w16cid:durableId="773095081">
     <w:abstractNumId w:val="16"/>
   </w:num>
-  <w:num w:numId="17">
+  <w:num w:numId="17" w16cid:durableId="80415011">
     <w:abstractNumId w:val="18"/>
   </w:num>
-  <w:num w:numId="18">
+  <w:num w:numId="18" w16cid:durableId="958755465">
     <w:abstractNumId w:val="9"/>
   </w:num>
-  <w:num w:numId="19">
+  <w:num w:numId="19" w16cid:durableId="1507793457">
     <w:abstractNumId w:val="17"/>
   </w:num>
-  <w:num w:numId="20">
+  <w:num w:numId="20" w16cid:durableId="709572352">
     <w:abstractNumId w:val="7"/>
   </w:num>
-  <w:num w:numId="21">
+  <w:num w:numId="21" w16cid:durableId="81419909">
     <w:abstractNumId w:val="19"/>
   </w:num>
-  <w:num w:numId="22">
+  <w:num w:numId="22" w16cid:durableId="917134553">
     <w:abstractNumId w:val="11"/>
   </w:num>
   <w:numIdMacAtCleanup w:val="22"/>
@@ -8742,7 +8578,7 @@
 </file>
 
 <file path=word/styles.xml><?xml version="1.0" encoding="utf-8"?>
-<w:styles xmlns:mc="http://schemas.openxmlformats.org/markup-compatibility/2006" xmlns:r="http://schemas.openxmlformats.org/officeDocument/2006/relationships" xmlns:w="http://schemas.openxmlformats.org/wordprocessingml/2006/main" xmlns:w14="http://schemas.microsoft.com/office/word/2010/wordml" xmlns:w15="http://schemas.microsoft.com/office/word/2012/wordml" xmlns:w16cex="http://schemas.microsoft.com/office/word/2018/wordml/cex" xmlns:w16cid="http://schemas.microsoft.com/office/word/2016/wordml/cid" xmlns:w16="http://schemas.microsoft.com/office/word/2018/wordml" xmlns:w16sdtdh="http://schemas.microsoft.com/office/word/2020/wordml/sdtdatahash" xmlns:w16se="http://schemas.microsoft.com/office/word/2015/wordml/symex" mc:Ignorable="w14 w15 w16se w16cid w16 w16cex w16sdtdh">
+<w:styles xmlns:mc="http://schemas.openxmlformats.org/markup-compatibility/2006" xmlns:r="http://schemas.openxmlformats.org/officeDocument/2006/relationships" xmlns:w="http://schemas.openxmlformats.org/wordprocessingml/2006/main" xmlns:w14="http://schemas.microsoft.com/office/word/2010/wordml" xmlns:w15="http://schemas.microsoft.com/office/word/2012/wordml" xmlns:w16cex="http://schemas.microsoft.com/office/word/2018/wordml/cex" xmlns:w16cid="http://schemas.microsoft.com/office/word/2016/wordml/cid" xmlns:w16="http://schemas.microsoft.com/office/word/2018/wordml" xmlns:w16du="http://schemas.microsoft.com/office/word/2023/wordml/word16du" xmlns:w16sdtdh="http://schemas.microsoft.com/office/word/2020/wordml/sdtdatahash" xmlns:w16sdtfl="http://schemas.microsoft.com/office/word/2024/wordml/sdtformatlock" xmlns:w16se="http://schemas.microsoft.com/office/word/2015/wordml/symex" mc:Ignorable="w14 w15 w16se w16cid w16 w16cex w16sdtdh w16sdtfl w16du">
   <w:docDefaults>
     <w:rPrDefault>
       <w:rPr>
@@ -9642,12 +9478,6 @@
 </file>
 
 <file path=customXml/item1.xml><?xml version="1.0" encoding="utf-8"?>
-<p:properties xmlns:p="http://schemas.microsoft.com/office/2006/metadata/properties" xmlns:xsi="http://www.w3.org/2001/XMLSchema-instance" xmlns:pc="http://schemas.microsoft.com/office/infopath/2007/PartnerControls">
-  <documentManagement/>
-</p:properties>
-</file>
-
-<file path=customXml/item2.xml><?xml version="1.0" encoding="utf-8"?>
 <?mso-contentType ?>
 <FormTemplates xmlns="http://schemas.microsoft.com/sharepoint/v3/contenttype/forms">
   <Display>DocumentLibraryForm</Display>
@@ -9656,7 +9486,17 @@
 </FormTemplates>
 </file>
 
+<file path=customXml/item2.xml><?xml version="1.0" encoding="utf-8"?>
+<p:properties xmlns:p="http://schemas.microsoft.com/office/2006/metadata/properties" xmlns:xsi="http://www.w3.org/2001/XMLSchema-instance" xmlns:pc="http://schemas.microsoft.com/office/infopath/2007/PartnerControls">
+  <documentManagement/>
+</p:properties>
+</file>
+
 <file path=customXml/item3.xml><?xml version="1.0" encoding="utf-8"?>
+<b:Sources xmlns:b="http://schemas.openxmlformats.org/officeDocument/2006/bibliography" xmlns="http://schemas.openxmlformats.org/officeDocument/2006/bibliography" SelectedStyle="\APASixthEditionOfficeOnline.xsl" StyleName="APA" Version="6"/>
+</file>
+
+<file path=customXml/item4.xml><?xml version="1.0" encoding="utf-8"?>
 <ct:contentTypeSchema xmlns:ct="http://schemas.microsoft.com/office/2006/metadata/contentType" xmlns:ma="http://schemas.microsoft.com/office/2006/metadata/properties/metaAttributes" ct:_="" ma:_="" ma:contentTypeName="Document" ma:contentTypeID="0x010100D909C6ED4832FC43965D7F44801A9D1D" ma:contentTypeVersion="3" ma:contentTypeDescription="Create a new document." ma:contentTypeScope="" ma:versionID="590b8e837e0c34ba68e237e432b89f2b">
   <xsd:schema xmlns:xsd="http://www.w3.org/2001/XMLSchema" xmlns:xs="http://www.w3.org/2001/XMLSchema" xmlns:p="http://schemas.microsoft.com/office/2006/metadata/properties" xmlns:ns2="9c554c5e-fb1a-4b33-8155-577131e00eb1" targetNamespace="http://schemas.microsoft.com/office/2006/metadata/properties" ma:root="true" ma:fieldsID="e7f67fa681a0455a4d483a9761e4a400" ns2:_="">
     <xsd:import namespace="9c554c5e-fb1a-4b33-8155-577131e00eb1"/>
@@ -9794,11 +9634,15 @@
 </ct:contentTypeSchema>
 </file>
 
-<file path=customXml/item4.xml><?xml version="1.0" encoding="utf-8"?>
-<b:Sources xmlns:b="http://schemas.openxmlformats.org/officeDocument/2006/bibliography" xmlns="http://schemas.openxmlformats.org/officeDocument/2006/bibliography" SelectedStyle="\APASixthEditionOfficeOnline.xsl" StyleName="APA" Version="6"/>
+<file path=customXml/itemProps1.xml><?xml version="1.0" encoding="utf-8"?>
+<ds:datastoreItem xmlns:ds="http://schemas.openxmlformats.org/officeDocument/2006/customXml" ds:itemID="{C3D076DE-DC03-41EE-B524-3239ED6441C9}">
+  <ds:schemaRefs>
+    <ds:schemaRef ds:uri="http://schemas.microsoft.com/sharepoint/v3/contenttype/forms"/>
+  </ds:schemaRefs>
+</ds:datastoreItem>
 </file>
 
-<file path=customXml/itemProps1.xml><?xml version="1.0" encoding="utf-8"?>
+<file path=customXml/itemProps2.xml><?xml version="1.0" encoding="utf-8"?>
 <ds:datastoreItem xmlns:ds="http://schemas.openxmlformats.org/officeDocument/2006/customXml" ds:itemID="{64F7C368-1930-4530-B8A6-58B9CE112E6F}">
   <ds:schemaRefs>
     <ds:schemaRef ds:uri="http://schemas.microsoft.com/office/2006/metadata/properties"/>
@@ -9807,15 +9651,15 @@
 </ds:datastoreItem>
 </file>
 
-<file path=customXml/itemProps2.xml><?xml version="1.0" encoding="utf-8"?>
-<ds:datastoreItem xmlns:ds="http://schemas.openxmlformats.org/officeDocument/2006/customXml" ds:itemID="{C3D076DE-DC03-41EE-B524-3239ED6441C9}">
+<file path=customXml/itemProps3.xml><?xml version="1.0" encoding="utf-8"?>
+<ds:datastoreItem xmlns:ds="http://schemas.openxmlformats.org/officeDocument/2006/customXml" ds:itemID="{079D4F6F-D119-4EF5-8C85-D6D8EF965778}">
   <ds:schemaRefs>
-    <ds:schemaRef ds:uri="http://schemas.microsoft.com/sharepoint/v3/contenttype/forms"/>
+    <ds:schemaRef ds:uri="http://schemas.openxmlformats.org/officeDocument/2006/bibliography"/>
   </ds:schemaRefs>
 </ds:datastoreItem>
 </file>
 
-<file path=customXml/itemProps3.xml><?xml version="1.0" encoding="utf-8"?>
+<file path=customXml/itemProps4.xml><?xml version="1.0" encoding="utf-8"?>
 <ds:datastoreItem xmlns:ds="http://schemas.openxmlformats.org/officeDocument/2006/customXml" ds:itemID="{C88CD9DE-55CB-44B3-BB3E-0D83773BA61C}">
   <ds:schemaRefs>
     <ds:schemaRef ds:uri="http://schemas.microsoft.com/office/2006/metadata/contentType"/>
@@ -9833,10 +9677,8 @@
 </ds:datastoreItem>
 </file>
 
-<file path=customXml/itemProps4.xml><?xml version="1.0" encoding="utf-8"?>
-<ds:datastoreItem xmlns:ds="http://schemas.openxmlformats.org/officeDocument/2006/customXml" ds:itemID="{079D4F6F-D119-4EF5-8C85-D6D8EF965778}">
-  <ds:schemaRefs>
-    <ds:schemaRef ds:uri="http://schemas.openxmlformats.org/officeDocument/2006/bibliography"/>
-  </ds:schemaRefs>
-</ds:datastoreItem>
+<file path=docMetadata/LabelInfo.xml><?xml version="1.0" encoding="utf-8"?>
+<clbl:labelList xmlns:clbl="http://schemas.microsoft.com/office/2020/mipLabelMetadata">
+  <clbl:label id="{9e2f9943-746a-4451-a8ff-469b397c481c}" enabled="1" method="Privileged" siteId="{46c9827f-ab05-45a8-b96f-476ecc729df9}" removed="0"/>
+</clbl:labelList>
 </file>
</xml_diff>